<commit_message>
Add categories: poetry, fiction, biography, film, obituary, language, politics
Poetry (22), fiction (7, three also biography), film (Direwolf hall,
Screening Polymorphous Perversity), obituary (Geoffrey Hill), language
(Thesaurus), politics (Could do better).

Co-Authored-By: Claude Sonnet 5.5 <noreply@anthropic.com>
</commit_message>
<xml_diff>
--- a/content-src/docx/A G 1997 08 14 Horror genre.docx
+++ b/content-src/docx/A G 1997 08 14 Horror genre.docx
@@ -15,6 +15,11 @@
     <w:p>
       <w:r>
         <w:t xml:space="preserve">&lt;details&gt;Null&lt;/details&gt;</w:t>
+      </w:r>
+    </w:p>
+    <w:p>
+      <w:r>
+        <w:t xml:space="preserve">&lt;category&gt;fiction&lt;/category&gt;</w:t>
       </w:r>
     </w:p>
     <w:p>

</xml_diff>